<commit_message>
Cuantificar CV con datos reales: cargas, pedidos UK, cargos/mes, SAP e inglés Trinity B2
Co-Authored-By: Claude Fable 5 <noreply@anthropic.com>
Claude-Session: https://claude.ai/code/session_0185px6MKozwawj1YRjUm8a4
</commit_message>
<xml_diff>
--- a/cv/CV_VersionA_Export.docx
+++ b/cv/CV_VersionA_Export.docx
@@ -54,7 +54,7 @@
     </w:p>
     <w:p>
       <w:r>
-        <w:t>Técnico Superior en Comercio Internacional con más de un año en Angel Camacho Alimentación (agroalimentaria exportadora), donde he pasado de prácticas a contrato laboral en menos de un año. He gestionado la operativa, facturación y documentación de cargas de exportación a EE. UU., Canadá, Sudamérica y Reino Unido —mercados de alta exigencia documental— y actualmente resuelvo incidencias y cargos con grandes cuentas de distribución nacional. Inglés B2 de uso profesional diario. Como diferencial: desarrollo herramientas de automatización (Python + IA) que mi departamento usa a diario.</w:t>
+        <w:t>Técnico Superior en Comercio Internacional con más de un año en Angel Camacho Alimentación (agroalimentaria exportadora), donde he pasado de prácticas a contrato laboral en menos de un año. He gestionado en SAP la operativa, facturación y documentación de cargas de exportación a EE. UU., Canadá, Sudamérica y Reino Unido —mercados de alta exigencia documental— y actualmente resuelvo incidencias y cargos con grandes cuentas de distribución nacional. Inglés B2 de uso profesional diario. Como diferencial: desarrollo herramientas de automatización (Python + IA) que mi departamento usa a diario.</w:t>
       </w:r>
     </w:p>
     <w:p>
@@ -116,7 +116,7 @@
         <w:spacing w:after="40"/>
       </w:pPr>
       <w:r>
-        <w:t>Gestiono el ciclo completo de cargos de clientes de grandes cuentas de distribución: análisis de diferencias de precio y de mercancía, documentación y resolución de incidencias — [X cargos/mes, ~X € analizados].</w:t>
+        <w:t>Gestiono el ciclo completo de cargos de clientes de grandes cuentas de distribución: análisis en SAP de diferencias de precio y de mercancía, documentación y resolución de incidencias — más de 100 cargos gestionados al mes.</w:t>
       </w:r>
     </w:p>
     <w:p>
@@ -125,7 +125,7 @@
         <w:spacing w:after="40"/>
       </w:pPr>
       <w:r>
-        <w:t>Desarrollé por iniciativa propia herramientas de automatización con Python, JavaScript y APIs de IA (extracción OCR de datos de facturas y cargos en PDF a Excel), hoy en uso diario en el departamento — [ahorro estimado de X horas/semana de trabajo manual].</w:t>
+        <w:t>Desarrollé por iniciativa propia herramientas de automatización con Python, JavaScript y APIs de IA (extracción OCR de datos de facturas y cargos en PDF a Excel), hoy en uso diario en el departamento — ahorro de varias horas semanales de trabajo manual.</w:t>
       </w:r>
     </w:p>
     <w:p>
@@ -150,7 +150,7 @@
         <w:spacing w:after="40"/>
       </w:pPr>
       <w:r>
-        <w:t>Gestioné la operativa de cargas de exportación a Sudamérica, EE. UU., Canadá y almacenes externos de Reino Unido — [X contenedores/cargas al mes].</w:t>
+        <w:t>Gestioné la operativa de cargas de exportación a Sudamérica, EE. UU., Canadá y almacenes externos de Reino Unido — entre 15 y 30 cargas mensuales.</w:t>
       </w:r>
     </w:p>
     <w:p>
@@ -159,7 +159,7 @@
         <w:spacing w:after="40"/>
       </w:pPr>
       <w:r>
-        <w:t>Grabé y gestioné los pedidos del mercado UK — [X pedidos/semana], con comunicación diaria en inglés con clientes y almacenes.</w:t>
+        <w:t>Grabé y gestioné en SAP los pedidos del mercado UK — 10-25 pedidos semanales, con comunicación diaria en inglés con clientes y almacenes.</w:t>
       </w:r>
     </w:p>
     <w:p>
@@ -168,7 +168,7 @@
         <w:spacing w:after="40"/>
       </w:pPr>
       <w:r>
-        <w:t>Responsable de la facturación y documentación de exportación de dichas cargas (factura comercial, packing list, [certificados]) para mercados de alta exigencia documental — [0 rechazos aduaneros / % incidencias].</w:t>
+        <w:t>Responsable de la facturación (SAP) y documentación de exportación de dichas cargas (factura comercial, packing list, certificados y documentación aduanera) para mercados de alta exigencia documental como EE. UU. y Canadá.</w:t>
       </w:r>
     </w:p>
     <w:p>
@@ -197,7 +197,7 @@
         <w:spacing w:after="40"/>
       </w:pPr>
       <w:r>
-        <w:t>Marca propia de creación de webs profesionales para restaurantes y negocios de la Costa del Sol: diseño y desarrollo (HTML/CSS/JavaScript), SEO local y trato comercial directo con el cliente — [X webs entregadas].</w:t>
+        <w:t>Marca propia de creación de webs profesionales para restaurantes y negocios de la Costa del Sol: ciclo completo con el cliente — captación, propuesta, diseño y desarrollo (HTML/CSS/JavaScript), SEO local y entrega.</w:t>
       </w:r>
     </w:p>
     <w:p>
@@ -214,7 +214,7 @@
         <w:spacing w:after="40"/>
       </w:pPr>
       <w:r>
-        <w:t>Creación y gestión de tiendas online propias (selección de producto, proveedores internacionales y logística) y campañas de Meta Ads en Facebook/Instagram: segmentación, creativos y optimización por resultados — [X € de inversión gestionada].</w:t>
+        <w:t>Creación y gestión de tiendas online propias (selección de producto, proveedores internacionales y logística) y campañas de Meta Ads en Facebook/Instagram: segmentación de audiencias, creativos y optimización por resultados.</w:t>
       </w:r>
     </w:p>
     <w:p>
@@ -252,7 +252,7 @@
         <w:spacing w:after="40"/>
       </w:pPr>
       <w:r>
-        <w:t>Comercio exterior: documentación de exportación (factura comercial, packing list, [certificados]), gestión de pedidos y cargas, Incoterms, gestión de incidencias y cargos con grandes cuentas.</w:t>
+        <w:t>Comercio exterior: documentación de exportación (factura comercial, packing list, certificados y documentación aduanera), gestión de pedidos y cargas, Incoterms, gestión de incidencias y cargos con grandes cuentas.</w:t>
       </w:r>
     </w:p>
     <w:p>
@@ -279,7 +279,7 @@
         <w:spacing w:after="40"/>
       </w:pPr>
       <w:r>
-        <w:t>Gestión y ofimática: ERP [nombre], Excel [tablas dinámicas, BUSCARV], Outlook.</w:t>
+        <w:t>Gestión y ofimática: SAP (pedidos, facturación, cargos), Excel de uso diario (análisis de cargos y control de entregas), Outlook.</w:t>
       </w:r>
     </w:p>
     <w:p>
@@ -309,7 +309,7 @@
         <w:spacing w:after="40"/>
       </w:pPr>
       <w:r>
-        <w:t>Inglés: B2 — uso profesional diario: documentación de exportación y gestión de pedidos con clientes de Reino Unido, EE. UU. y Canadá. [Certificado oficial si existe]</w:t>
+        <w:t>Inglés: B2 — uso profesional diario: documentación de exportación y gestión de pedidos con clientes de Reino Unido, EE. UU. y Canadá. Certificación Trinity (Reading y Writing, nivel B2).</w:t>
       </w:r>
     </w:p>
     <w:sectPr>

</xml_diff>

<commit_message>
Completar CV con datos personales: nombre, contacto, formación y fechas de proyectos
Co-Authored-By: Claude Fable 5 <noreply@anthropic.com>
Claude-Session: https://claude.ai/code/session_0185px6MKozwawj1YRjUm8a4
</commit_message>
<xml_diff>
--- a/cv/CV_VersionA_Export.docx
+++ b/cv/CV_VersionA_Export.docx
@@ -11,7 +11,7 @@
           <w:b/>
           <w:sz w:val="38"/>
         </w:rPr>
-        <w:t>[Nombre y Apellidos]</w:t>
+        <w:t>Pablo Montes Soriano</w:t>
       </w:r>
     </w:p>
     <w:p>
@@ -37,7 +37,7 @@
         </w:rPr>
         <w:t>Morón de la Frontera (Sevilla) · Disponibilidad: Sevilla capital y Torrox Costa (Málaga) · Carnet B y vehículo propio</w:t>
         <w:br/>
-        <w:t>[Teléfono] · pablossmontes1155@icloud.com · [LinkedIn]</w:t>
+        <w:t>633 786 374 · pablossmontes1155@icloud.com · linkedin.com/in/pablo-montes-soriano-017b70308</w:t>
       </w:r>
     </w:p>
     <w:p>
@@ -188,7 +188,7 @@
         <w:rPr>
           <w:b/>
         </w:rPr>
-        <w:t>Sorwebs — Diseño web para negocios locales · [año] – actualidad</w:t>
+        <w:t>Sorwebs — Diseño web para negocios locales · 2026 – actualidad</w:t>
       </w:r>
     </w:p>
     <w:p>
@@ -205,7 +205,7 @@
         <w:rPr>
           <w:b/>
         </w:rPr>
-        <w:t>Publicidad digital y e-commerce · [año] – [año/actualidad]</w:t>
+        <w:t>Publicidad digital y e-commerce · 2024 – 2025</w:t>
       </w:r>
     </w:p>
     <w:p>
@@ -231,7 +231,7 @@
     </w:p>
     <w:p>
       <w:r>
-        <w:t>Técnico Superior en Comercio Internacional (FP de Grado Superior) — [Centro], [ciudad] · [año] – [año]</w:t>
+        <w:t>Técnico Superior en Comercio Internacional (FP de Grado Superior) — IES Cristóbal de Monroy, Alcalá de Guadaíra (Sevilla) · 2023 – 2025</w:t>
       </w:r>
     </w:p>
     <w:p>

</xml_diff>